<commit_message>
Match the evaluation sheet to the original template wording
Two places had drifted from the template handed out for the course:

- The "Snap of the UI" instruction had been shortened. Restore the
  original sentence verbatim, including the parenthetical example.
- The footer had dropped the "Page X of Y" counter. Restore it as
  live page-number fields, so it counts the pages this filled-in
  copy actually has rather than the blank template's two.

A token-level comparison against the original PDF now shows every
word of the template reproduced.

Co-Authored-By: Claude Opus 5 <noreply@anthropic.com>
Claude-Session: https://claude.ai/code/session_017djqhZPqHXajoK6uSk2hUT
</commit_message>
<xml_diff>
--- a/CO3_Project_Evaluation_Sheet_Filled.docx
+++ b/CO3_Project_Evaluation_Sheet_Filled.docx
@@ -2220,7 +2220,7 @@
           <w:sz w:val="17"/>
           <w:szCs w:val="17"/>
         </w:rPr>
-        <w:t xml:space="preserve">Screenshots of the main pages and forms of the prototype.</w:t>
+        <w:t xml:space="preserve">Attach screenshots of the main pages and forms of the prototype (for example, the home page and a form with JavaScript validation).</w:t>
       </w:r>
     </w:p>
     <w:p>
@@ -2800,7 +2800,43 @@
         <w:sz w:val="16"/>
         <w:szCs w:val="16"/>
       </w:rPr>
-      <w:t xml:space="preserve">CSC 3215 Web Technologies  |  Fall 2026-27  |  Project Prototype Part 1 (CO3)</w:t>
+      <w:t xml:space="preserve">CSC 3215 Web Technologies  |  Fall 2026-27  |  Project Prototype Part 1 (CO3)  |  Page </w:t>
+    </w:r>
+    <w:r>
+      <w:rPr>
+        <w:rFonts w:ascii="Cambria" w:cs="Cambria" w:eastAsia="Cambria" w:hAnsi="Cambria"/>
+        <w:i/>
+        <w:iCs/>
+        <w:sz w:val="16"/>
+        <w:szCs w:val="16"/>
+      </w:rPr>
+      <w:fldChar w:fldCharType="begin"/>
+      <w:instrText xml:space="preserve">PAGE</w:instrText>
+      <w:fldChar w:fldCharType="separate"/>
+      <w:fldChar w:fldCharType="end"/>
+    </w:r>
+    <w:r>
+      <w:rPr>
+        <w:rFonts w:ascii="Cambria" w:cs="Cambria" w:eastAsia="Cambria" w:hAnsi="Cambria"/>
+        <w:i/>
+        <w:iCs/>
+        <w:sz w:val="16"/>
+        <w:szCs w:val="16"/>
+      </w:rPr>
+      <w:t xml:space="preserve"> of </w:t>
+    </w:r>
+    <w:r>
+      <w:rPr>
+        <w:rFonts w:ascii="Cambria" w:cs="Cambria" w:eastAsia="Cambria" w:hAnsi="Cambria"/>
+        <w:i/>
+        <w:iCs/>
+        <w:sz w:val="16"/>
+        <w:szCs w:val="16"/>
+      </w:rPr>
+      <w:fldChar w:fldCharType="begin"/>
+      <w:instrText xml:space="preserve">NUMPAGES</w:instrText>
+      <w:fldChar w:fldCharType="separate"/>
+      <w:fldChar w:fldCharType="end"/>
     </w:r>
   </w:p>
 </w:ftr>

</xml_diff>

<commit_message>
Keep only the registration form screenshot in the evaluation sheet
The sheet asks for a form with JavaScript validation, so the extra
dashboard, ticket, profile and admin screenshots are not needed.
Dropping them also brings the document back to two pages, matching
the original template's length.

Everything else is unchanged.

Co-Authored-By: Claude Opus 5 <noreply@anthropic.com>
Claude-Session: https://claude.ai/code/session_017djqhZPqHXajoK6uSk2hUT
</commit_message>
<xml_diff>
--- a/CO3_Project_Evaluation_Sheet_Filled.docx
+++ b/CO3_Project_Evaluation_Sheet_Filled.docx
@@ -2238,94 +2238,7 @@
           <w:sz w:val="19"/>
           <w:szCs w:val="19"/>
         </w:rPr>
-        <w:t xml:space="preserve">1. Home Page (index.php)</w:t>
-      </w:r>
-    </w:p>
-    <w:p>
-      <w:pPr>
-        <w:spacing w:after="30"/>
-      </w:pPr>
-      <w:r>
-        <w:rPr>
-          <w:rFonts w:ascii="Calibri" w:cs="Calibri" w:eastAsia="Calibri" w:hAnsi="Calibri"/>
-          <w:b w:val="false"/>
-          <w:bCs w:val="false"/>
-          <w:i/>
-          <w:iCs/>
-          <w:color w:val="000000"/>
-          <w:sz w:val="17"/>
-          <w:szCs w:val="17"/>
-        </w:rPr>
-        <w:t xml:space="preserve">Landing page with Log in and Register actions.</w:t>
-      </w:r>
-    </w:p>
-    <w:p>
-      <w:pPr>
-        <w:spacing w:after="140"/>
-        <w:jc w:val="center"/>
-      </w:pPr>
-      <w:r>
-        <w:drawing>
-          <wp:inline distT="0" distB="0" distL="0" distR="0">
-            <wp:extent cx="5334000" cy="3333750"/>
-            <wp:effectExtent t="0" r="0" b="0" l="0"/>
-            <wp:docPr id="1" name="" descr="" title=""/>
-            <wp:cNvGraphicFramePr>
-              <a:graphicFrameLocks xmlns:a="http://schemas.openxmlformats.org/drawingml/2006/main" noChangeAspect="1"/>
-            </wp:cNvGraphicFramePr>
-            <a:graphic xmlns:a="http://schemas.openxmlformats.org/drawingml/2006/main">
-              <a:graphicData uri="http://schemas.openxmlformats.org/drawingml/2006/picture">
-                <pic:pic xmlns:pic="http://schemas.openxmlformats.org/drawingml/2006/picture">
-                  <pic:nvPicPr>
-                    <pic:cNvPr id="0" name="" descr=""/>
-                    <pic:cNvPicPr>
-                      <a:picLocks noChangeAspect="1" noChangeArrowheads="1"/>
-                    </pic:cNvPicPr>
-                  </pic:nvPicPr>
-                  <pic:blipFill>
-                    <a:blip r:embed="rId9" cstate="none"/>
-                    <a:srcRect/>
-                    <a:stretch>
-                      <a:fillRect/>
-                    </a:stretch>
-                  </pic:blipFill>
-                  <pic:spPr bwMode="auto">
-                    <a:xfrm>
-                      <a:off x="0" y="0"/>
-                      <a:ext cx="5334000" cy="3333750"/>
-                    </a:xfrm>
-                    <a:prstGeom prst="rect">
-                      <a:avLst/>
-                    </a:prstGeom>
-                  </pic:spPr>
-                </pic:pic>
-              </a:graphicData>
-            </a:graphic>
-          </wp:inline>
-        </w:drawing>
-      </w:r>
-    </w:p>
-    <w:p>
-      <w:r>
-        <w:br w:type="page"/>
-      </w:r>
-    </w:p>
-    <w:p>
-      <w:pPr>
-        <w:spacing w:after="40" w:before="120"/>
-      </w:pPr>
-      <w:r>
-        <w:rPr>
-          <w:rFonts w:ascii="Calibri" w:cs="Calibri" w:eastAsia="Calibri" w:hAnsi="Calibri"/>
-          <w:b/>
-          <w:bCs/>
-          <w:i w:val="false"/>
-          <w:iCs w:val="false"/>
-          <w:color w:val="1F3864"/>
-          <w:sz w:val="19"/>
-          <w:szCs w:val="19"/>
-        </w:rPr>
-        <w:t xml:space="preserve">2. Registration Form — JavaScript Validation</w:t>
+        <w:t xml:space="preserve">Registration Form — JavaScript Validation</w:t>
       </w:r>
     </w:p>
     <w:p>
@@ -2354,7 +2267,7 @@
       <w:r>
         <w:drawing>
           <wp:inline distT="0" distB="0" distL="0" distR="0">
-            <wp:extent cx="5334000" cy="3333750"/>
+            <wp:extent cx="5715000" cy="3571875"/>
             <wp:effectExtent t="0" r="0" b="0" l="0"/>
             <wp:docPr id="1" name="" descr="" title=""/>
             <wp:cNvGraphicFramePr>
@@ -2370,7 +2283,7 @@
                     </pic:cNvPicPr>
                   </pic:nvPicPr>
                   <pic:blipFill>
-                    <a:blip r:embed="rId10" cstate="none"/>
+                    <a:blip r:embed="rId9" cstate="none"/>
                     <a:srcRect/>
                     <a:stretch>
                       <a:fillRect/>
@@ -2379,345 +2292,7 @@
                   <pic:spPr bwMode="auto">
                     <a:xfrm>
                       <a:off x="0" y="0"/>
-                      <a:ext cx="5334000" cy="3333750"/>
-                    </a:xfrm>
-                    <a:prstGeom prst="rect">
-                      <a:avLst/>
-                    </a:prstGeom>
-                  </pic:spPr>
-                </pic:pic>
-              </a:graphicData>
-            </a:graphic>
-          </wp:inline>
-        </w:drawing>
-      </w:r>
-    </w:p>
-    <w:p>
-      <w:r>
-        <w:br w:type="page"/>
-      </w:r>
-    </w:p>
-    <w:p>
-      <w:pPr>
-        <w:spacing w:after="40" w:before="120"/>
-      </w:pPr>
-      <w:r>
-        <w:rPr>
-          <w:rFonts w:ascii="Calibri" w:cs="Calibri" w:eastAsia="Calibri" w:hAnsi="Calibri"/>
-          <w:b/>
-          <w:bCs/>
-          <w:i w:val="false"/>
-          <w:iCs w:val="false"/>
-          <w:color w:val="1F3864"/>
-          <w:sz w:val="19"/>
-          <w:szCs w:val="19"/>
-        </w:rPr>
-        <w:t xml:space="preserve">3. Passenger Dashboard — AJAX Purchase and DOM Receipt</w:t>
-      </w:r>
-    </w:p>
-    <w:p>
-      <w:pPr>
-        <w:spacing w:after="30"/>
-      </w:pPr>
-      <w:r>
-        <w:rPr>
-          <w:rFonts w:ascii="Calibri" w:cs="Calibri" w:eastAsia="Calibri" w:hAnsi="Calibri"/>
-          <w:b w:val="false"/>
-          <w:bCs w:val="false"/>
-          <w:i/>
-          <w:iCs/>
-          <w:color w:val="000000"/>
-          <w:sz w:val="17"/>
-          <w:szCs w:val="17"/>
-        </w:rPr>
-        <w:t xml:space="preserve">The ticket is bought without reloading the page and the receipt is built in the DOM from the JSON reply.</w:t>
-      </w:r>
-    </w:p>
-    <w:p>
-      <w:pPr>
-        <w:spacing w:after="140"/>
-        <w:jc w:val="center"/>
-      </w:pPr>
-      <w:r>
-        <w:drawing>
-          <wp:inline distT="0" distB="0" distL="0" distR="0">
-            <wp:extent cx="5334000" cy="4257675"/>
-            <wp:effectExtent t="0" r="0" b="0" l="0"/>
-            <wp:docPr id="1" name="" descr="" title=""/>
-            <wp:cNvGraphicFramePr>
-              <a:graphicFrameLocks xmlns:a="http://schemas.openxmlformats.org/drawingml/2006/main" noChangeAspect="1"/>
-            </wp:cNvGraphicFramePr>
-            <a:graphic xmlns:a="http://schemas.openxmlformats.org/drawingml/2006/main">
-              <a:graphicData uri="http://schemas.openxmlformats.org/drawingml/2006/picture">
-                <pic:pic xmlns:pic="http://schemas.openxmlformats.org/drawingml/2006/picture">
-                  <pic:nvPicPr>
-                    <pic:cNvPr id="0" name="" descr=""/>
-                    <pic:cNvPicPr>
-                      <a:picLocks noChangeAspect="1" noChangeArrowheads="1"/>
-                    </pic:cNvPicPr>
-                  </pic:nvPicPr>
-                  <pic:blipFill>
-                    <a:blip r:embed="rId11" cstate="none"/>
-                    <a:srcRect/>
-                    <a:stretch>
-                      <a:fillRect/>
-                    </a:stretch>
-                  </pic:blipFill>
-                  <pic:spPr bwMode="auto">
-                    <a:xfrm>
-                      <a:off x="0" y="0"/>
-                      <a:ext cx="5334000" cy="4257675"/>
-                    </a:xfrm>
-                    <a:prstGeom prst="rect">
-                      <a:avLst/>
-                    </a:prstGeom>
-                  </pic:spPr>
-                </pic:pic>
-              </a:graphicData>
-            </a:graphic>
-          </wp:inline>
-        </w:drawing>
-      </w:r>
-    </w:p>
-    <w:p>
-      <w:pPr>
-        <w:spacing w:after="40" w:before="120"/>
-      </w:pPr>
-      <w:r>
-        <w:rPr>
-          <w:rFonts w:ascii="Calibri" w:cs="Calibri" w:eastAsia="Calibri" w:hAnsi="Calibri"/>
-          <w:b/>
-          <w:bCs/>
-          <w:i w:val="false"/>
-          <w:iCs w:val="false"/>
-          <w:color w:val="1F3864"/>
-          <w:sz w:val="19"/>
-          <w:szCs w:val="19"/>
-        </w:rPr>
-        <w:t xml:space="preserve">4. My Tickets — DOM Table with Search, Filter and Sorting</w:t>
-      </w:r>
-    </w:p>
-    <w:p>
-      <w:pPr>
-        <w:spacing w:after="30"/>
-      </w:pPr>
-      <w:r>
-        <w:rPr>
-          <w:rFonts w:ascii="Calibri" w:cs="Calibri" w:eastAsia="Calibri" w:hAnsi="Calibri"/>
-          <w:b w:val="false"/>
-          <w:bCs w:val="false"/>
-          <w:i/>
-          <w:iCs/>
-          <w:color w:val="000000"/>
-          <w:sz w:val="17"/>
-          <w:szCs w:val="17"/>
-        </w:rPr>
-        <w:t xml:space="preserve">Purchase history loaded over AJAX; rows are created with createElement and can be searched, filtered, sorted and cancelled.</w:t>
-      </w:r>
-    </w:p>
-    <w:p>
-      <w:pPr>
-        <w:spacing w:after="140"/>
-        <w:jc w:val="center"/>
-      </w:pPr>
-      <w:r>
-        <w:drawing>
-          <wp:inline distT="0" distB="0" distL="0" distR="0">
-            <wp:extent cx="5334000" cy="3333750"/>
-            <wp:effectExtent t="0" r="0" b="0" l="0"/>
-            <wp:docPr id="1" name="" descr="" title=""/>
-            <wp:cNvGraphicFramePr>
-              <a:graphicFrameLocks xmlns:a="http://schemas.openxmlformats.org/drawingml/2006/main" noChangeAspect="1"/>
-            </wp:cNvGraphicFramePr>
-            <a:graphic xmlns:a="http://schemas.openxmlformats.org/drawingml/2006/main">
-              <a:graphicData uri="http://schemas.openxmlformats.org/drawingml/2006/picture">
-                <pic:pic xmlns:pic="http://schemas.openxmlformats.org/drawingml/2006/picture">
-                  <pic:nvPicPr>
-                    <pic:cNvPr id="0" name="" descr=""/>
-                    <pic:cNvPicPr>
-                      <a:picLocks noChangeAspect="1" noChangeArrowheads="1"/>
-                    </pic:cNvPicPr>
-                  </pic:nvPicPr>
-                  <pic:blipFill>
-                    <a:blip r:embed="rId12" cstate="none"/>
-                    <a:srcRect/>
-                    <a:stretch>
-                      <a:fillRect/>
-                    </a:stretch>
-                  </pic:blipFill>
-                  <pic:spPr bwMode="auto">
-                    <a:xfrm>
-                      <a:off x="0" y="0"/>
-                      <a:ext cx="5334000" cy="3333750"/>
-                    </a:xfrm>
-                    <a:prstGeom prst="rect">
-                      <a:avLst/>
-                    </a:prstGeom>
-                  </pic:spPr>
-                </pic:pic>
-              </a:graphicData>
-            </a:graphic>
-          </wp:inline>
-        </w:drawing>
-      </w:r>
-    </w:p>
-    <w:p>
-      <w:r>
-        <w:br w:type="page"/>
-      </w:r>
-    </w:p>
-    <w:p>
-      <w:pPr>
-        <w:spacing w:after="40" w:before="120"/>
-      </w:pPr>
-      <w:r>
-        <w:rPr>
-          <w:rFonts w:ascii="Calibri" w:cs="Calibri" w:eastAsia="Calibri" w:hAnsi="Calibri"/>
-          <w:b/>
-          <w:bCs/>
-          <w:i w:val="false"/>
-          <w:iCs w:val="false"/>
-          <w:color w:val="1F3864"/>
-          <w:sz w:val="19"/>
-          <w:szCs w:val="19"/>
-        </w:rPr>
-        <w:t xml:space="preserve">5. Admin Dashboard — Customer Management</w:t>
-      </w:r>
-    </w:p>
-    <w:p>
-      <w:pPr>
-        <w:spacing w:after="30"/>
-      </w:pPr>
-      <w:r>
-        <w:rPr>
-          <w:rFonts w:ascii="Calibri" w:cs="Calibri" w:eastAsia="Calibri" w:hAnsi="Calibri"/>
-          <w:b w:val="false"/>
-          <w:bCs w:val="false"/>
-          <w:i/>
-          <w:iCs/>
-          <w:color w:val="000000"/>
-          <w:sz w:val="17"/>
-          <w:szCs w:val="17"/>
-        </w:rPr>
-        <w:t xml:space="preserve">Customers are listed over AJAX with live search; Edit and Delete act in place without leaving the page.</w:t>
-      </w:r>
-    </w:p>
-    <w:p>
-      <w:pPr>
-        <w:spacing w:after="140"/>
-        <w:jc w:val="center"/>
-      </w:pPr>
-      <w:r>
-        <w:drawing>
-          <wp:inline distT="0" distB="0" distL="0" distR="0">
-            <wp:extent cx="5334000" cy="3333750"/>
-            <wp:effectExtent t="0" r="0" b="0" l="0"/>
-            <wp:docPr id="1" name="" descr="" title=""/>
-            <wp:cNvGraphicFramePr>
-              <a:graphicFrameLocks xmlns:a="http://schemas.openxmlformats.org/drawingml/2006/main" noChangeAspect="1"/>
-            </wp:cNvGraphicFramePr>
-            <a:graphic xmlns:a="http://schemas.openxmlformats.org/drawingml/2006/main">
-              <a:graphicData uri="http://schemas.openxmlformats.org/drawingml/2006/picture">
-                <pic:pic xmlns:pic="http://schemas.openxmlformats.org/drawingml/2006/picture">
-                  <pic:nvPicPr>
-                    <pic:cNvPr id="0" name="" descr=""/>
-                    <pic:cNvPicPr>
-                      <a:picLocks noChangeAspect="1" noChangeArrowheads="1"/>
-                    </pic:cNvPicPr>
-                  </pic:nvPicPr>
-                  <pic:blipFill>
-                    <a:blip r:embed="rId13" cstate="none"/>
-                    <a:srcRect/>
-                    <a:stretch>
-                      <a:fillRect/>
-                    </a:stretch>
-                  </pic:blipFill>
-                  <pic:spPr bwMode="auto">
-                    <a:xfrm>
-                      <a:off x="0" y="0"/>
-                      <a:ext cx="5334000" cy="3333750"/>
-                    </a:xfrm>
-                    <a:prstGeom prst="rect">
-                      <a:avLst/>
-                    </a:prstGeom>
-                  </pic:spPr>
-                </pic:pic>
-              </a:graphicData>
-            </a:graphic>
-          </wp:inline>
-        </w:drawing>
-      </w:r>
-    </w:p>
-    <w:p>
-      <w:pPr>
-        <w:spacing w:after="40" w:before="120"/>
-      </w:pPr>
-      <w:r>
-        <w:rPr>
-          <w:rFonts w:ascii="Calibri" w:cs="Calibri" w:eastAsia="Calibri" w:hAnsi="Calibri"/>
-          <w:b/>
-          <w:bCs/>
-          <w:i w:val="false"/>
-          <w:iCs w:val="false"/>
-          <w:color w:val="1F3864"/>
-          <w:sz w:val="19"/>
-          <w:szCs w:val="19"/>
-        </w:rPr>
-        <w:t xml:space="preserve">6. Admin Ticket Sales — Statistics, Chart and CSV Export</w:t>
-      </w:r>
-    </w:p>
-    <w:p>
-      <w:pPr>
-        <w:spacing w:after="30"/>
-      </w:pPr>
-      <w:r>
-        <w:rPr>
-          <w:rFonts w:ascii="Calibri" w:cs="Calibri" w:eastAsia="Calibri" w:hAnsi="Calibri"/>
-          <w:b w:val="false"/>
-          <w:bCs w:val="false"/>
-          <w:i/>
-          <w:iCs/>
-          <w:color w:val="000000"/>
-          <w:sz w:val="17"/>
-          <w:szCs w:val="17"/>
-        </w:rPr>
-        <w:t xml:space="preserve">Sales statistics, a busiest-routes bar chart drawn with DOM nodes, sortable columns and a CSV export built in the browser.</w:t>
-      </w:r>
-    </w:p>
-    <w:p>
-      <w:pPr>
-        <w:spacing w:after="140"/>
-        <w:jc w:val="center"/>
-      </w:pPr>
-      <w:r>
-        <w:drawing>
-          <wp:inline distT="0" distB="0" distL="0" distR="0">
-            <wp:extent cx="5334000" cy="3333750"/>
-            <wp:effectExtent t="0" r="0" b="0" l="0"/>
-            <wp:docPr id="1" name="" descr="" title=""/>
-            <wp:cNvGraphicFramePr>
-              <a:graphicFrameLocks xmlns:a="http://schemas.openxmlformats.org/drawingml/2006/main" noChangeAspect="1"/>
-            </wp:cNvGraphicFramePr>
-            <a:graphic xmlns:a="http://schemas.openxmlformats.org/drawingml/2006/main">
-              <a:graphicData uri="http://schemas.openxmlformats.org/drawingml/2006/picture">
-                <pic:pic xmlns:pic="http://schemas.openxmlformats.org/drawingml/2006/picture">
-                  <pic:nvPicPr>
-                    <pic:cNvPr id="0" name="" descr=""/>
-                    <pic:cNvPicPr>
-                      <a:picLocks noChangeAspect="1" noChangeArrowheads="1"/>
-                    </pic:cNvPicPr>
-                  </pic:nvPicPr>
-                  <pic:blipFill>
-                    <a:blip r:embed="rId14" cstate="none"/>
-                    <a:srcRect/>
-                    <a:stretch>
-                      <a:fillRect/>
-                    </a:stretch>
-                  </pic:blipFill>
-                  <pic:spPr bwMode="auto">
-                    <a:xfrm>
-                      <a:off x="0" y="0"/>
-                      <a:ext cx="5334000" cy="3333750"/>
+                      <a:ext cx="5715000" cy="3571875"/>
                     </a:xfrm>
                     <a:prstGeom prst="rect">
                       <a:avLst/>

</xml_diff>